<commit_message>
Fix KaTeX math formatting in Concept Matrix and Notes, add Dark Mode, and implement static site exporter for Vercel/GitHub
</commit_message>
<xml_diff>
--- a/data/exports/alternating-current_revision_notes.docx
+++ b/data/exports/alternating-current_revision_notes.docx
@@ -1151,7 +1151,7 @@
         <w:rPr>
           <w:sz w:val="20"/>
         </w:rPr>
-        <w:t>Series LCR impedance Z = sqrt(R^2 + (X_L - X_C)^2). Current I = V / Z. Phase angle tan(phi) = (X_L - X_C) / R. Voltage across elements V = sqrt(V_R^2 + (V_L - V_C)^2).</w:t>
+        <w:t>Series LCR impedance Z = √(R^2 + (X_L - X_C)^2). Circuit current I = (V / Z). Phase angle tanϕ = (X_L - X_C / R). Net voltage phasor V_(total) = √(V_R^2 + (V_L - V_C)^2).</w:t>
       </w:r>
     </w:p>
     <w:tbl>
@@ -1189,7 +1189,7 @@
                 <w:color w:val="2D3748"/>
                 <w:sz w:val="19"/>
               </w:rPr>
-              <w:t>Voltages across series AC components do NOT add algebraically! V_total != V_R + V_L + V_C. Use phasor vector addition: V_total = sqrt(V_R^2 + (V_L - V_C)^2).</w:t>
+              <w:t>Voltages across series AC elements do NOT add algebraically: V_(total) ≠ V_R + V_L + V_C! Always use phasor vector addition: V_(total) = √(V_R^2 + (V_L - V_C)^2).</w:t>
             </w:r>
           </w:p>
         </w:tc>
@@ -1230,7 +1230,7 @@
                 <w:color w:val="2D3748"/>
                 <w:sz w:val="19"/>
               </w:rPr>
-              <w:t>If X_L &gt; X_C, circuit is inductive (voltage leads current). If X_C &gt; X_L, circuit is capacitive (current leads voltage).</w:t>
+              <w:t>If X_L &gt; X_C, circuit is inductive (voltage leads current by ϕ). If X_C &gt; X_L, circuit is capacitive (current leads voltage by ϕ).</w:t>
             </w:r>
           </w:p>
         </w:tc>
@@ -1359,7 +1359,7 @@
         <w:rPr>
           <w:sz w:val="20"/>
         </w:rPr>
-        <w:t>Sinusoidal AC quantities: I_rms = I_0 / sqrt(2) approx 0.707*I_0, V_rms = V_0 / sqrt(2). Average current over full cycle is 0, over half cycle is (2/pi)*I_0 approx 0.637*I_0.</w:t>
+        <w:t>Sinusoidal AC quantities: I_(rms) = \fracI_0√(2) ≈ 0.707 I_0, V_(rms) = \fracV_0√(2). Average current over full cycle is 0; average over half cycle is I_(avg, half) = (2I_0 / π) ≈ 0.637 I_0.</w:t>
       </w:r>
     </w:p>
     <w:tbl>
@@ -1397,7 +1397,7 @@
                 <w:color w:val="2D3748"/>
                 <w:sz w:val="19"/>
               </w:rPr>
-              <w:t>AC voltmeters and ammeters measure RMS values, not peak values! When JEE specifies '220 V AC', it always denotes V_rms.</w:t>
+              <w:t>AC voltmeters and ammeters measure RMS values, not peak values! When JEE specifies '220 V AC', it always denotes V_(rms) (peak voltage is V_0 = 220√(2) ≈ 311 V).</w:t>
             </w:r>
           </w:p>
         </w:tc>
@@ -1438,7 +1438,7 @@
                 <w:color w:val="2D3748"/>
                 <w:sz w:val="19"/>
               </w:rPr>
-              <w:t>Peak voltage for 220 V AC household line is 220 * sqrt(2) approx 311 V.</w:t>
+              <w:t>Instantaneous power p(t) = v(t)i(t) fluctuates at double frequency (2ω) about average power P_(avg) = V_(rms)I_(rms)cosϕ.</w:t>
             </w:r>
           </w:p>
         </w:tc>
@@ -1567,7 +1567,7 @@
         <w:rPr>
           <w:sz w:val="20"/>
         </w:rPr>
-        <w:t>Pure L: voltage leads current by 90° (pi/2), X_L = omega*L = 2*pi*f*L. Pure C: current leads voltage by 90° (pi/2), X_C = 1 / (omega*C) = 1 / (2*pi*f*C).</w:t>
+        <w:t>Pure Inductor: Voltage leads current by 90° ((π / 2)), inductive reactance X_L = ω L = 2π f L. Pure Capacitor: Current leads voltage by 90°, capacitive reactance X_C = (1 / ω C) = (1 / 2π f C).</w:t>
       </w:r>
     </w:p>
     <w:tbl>
@@ -1605,7 +1605,7 @@
                 <w:color w:val="2D3748"/>
                 <w:sz w:val="19"/>
               </w:rPr>
-              <w:t>In DC (f = 0), inductor has X_L = 0 (short circuit) and capacitor has X_C = infinity (open circuit/blocks DC).</w:t>
+              <w:t>In direct current (DC, f = 0), an inductor offers zero reactance (X_L = 0, short circuit) while a capacitor offers infinite reactance (X_C \to ∞, blocking DC completely).</w:t>
             </w:r>
           </w:p>
         </w:tc>
@@ -1646,7 +1646,7 @@
                 <w:color w:val="2D3748"/>
                 <w:sz w:val="19"/>
               </w:rPr>
-              <w:t>Mnemonic 'CIVIL': In Capacitor (C), Current (I) leads Voltage (V); in Inductor (L), Voltage (V) leads Current (I).</w:t>
+              <w:t>Mnemonic 'CIVIL': In a Capacitor (C), Current (I) leads Voltage (V); in an Inductor (L), Voltage (V) leads Current (I).</w:t>
             </w:r>
           </w:p>
         </w:tc>
@@ -1775,7 +1775,7 @@
         <w:rPr>
           <w:sz w:val="20"/>
         </w:rPr>
-        <w:t>At resonance: X_L = X_C, omega_0 = 1 / sqrt(L*C), f_0 = 1 / (2*pi*sqrt(L*C)). Impedance is purely resistive and minimum (Z = R), current is maximum (I = V/R). Q = (1/R)*sqrt(L/C) = omega_0 / Delta_omega.</w:t>
+        <w:t>At resonance: X_L = X_C, resonant frequency ω_0 = \frac1√(LC) (f_0 = \frac12π√(LC)). Minimum impedance Z_(\min) = R, maximum current I_(\max) = (V / R). Quality factor Q = (ω_0 L / R) = (1 / ω_0 C R) = (1 / R)√((L / C)) = (ω_0 / Δω).</w:t>
       </w:r>
     </w:p>
     <w:tbl>
@@ -1813,7 +1813,7 @@
                 <w:color w:val="2D3748"/>
                 <w:sz w:val="19"/>
               </w:rPr>
-              <w:t>At resonance, V_L and V_C are NOT zero! In fact, V_L = V_C = Q * V_supply, which can be much larger than supply voltage (voltage magnification)!</w:t>
+              <w:t>At resonance, V_L and V_C are NOT zero! In fact, V_L = V_C = Q · V_(supply), which can be substantially higher than supply voltage (voltage magnification)!</w:t>
             </w:r>
           </w:p>
         </w:tc>
@@ -1854,7 +1854,7 @@
                 <w:color w:val="2D3748"/>
                 <w:sz w:val="19"/>
               </w:rPr>
-              <w:t>Bandwidth Delta_omega = R / L. To increase sharpness of resonance (higher Q), decrease R or increase L/C ratio.</w:t>
+              <w:t>Resonance bandwidth Δω = (R / L). To sharpen resonance (higher Q), decrease resistance R or increase the (L / C) ratio.</w:t>
             </w:r>
           </w:p>
         </w:tc>
@@ -1983,7 +1983,7 @@
         <w:rPr>
           <w:sz w:val="20"/>
         </w:rPr>
-        <w:t>Average power P_avg = V_rms * I_rms * cos(phi). Power factor = cos(phi) = R / Z. In pure L or pure C, phi = 90°, cos(phi) = 0, so average power dissipated is zero (wattless current I_wattless = I_rms * sin(phi)).</w:t>
+        <w:t>Average power dissipated P_(avg) = V_(rms) I_(rms) cosϕ. Power factor cosϕ = (R / Z) = \fracR√(R^2 + (X_L - X_C)^2). Wattless current component I_(wattless) = I_(rms) sinϕ.</w:t>
       </w:r>
     </w:p>
     <w:tbl>
@@ -2021,7 +2021,7 @@
                 <w:color w:val="2D3748"/>
                 <w:sz w:val="19"/>
               </w:rPr>
-              <w:t>Power factor is cos(phi), not tan(phi)! Always compute Z first: cos(phi) = R / Z.</w:t>
+              <w:t>Power factor is cosϕ = (R / Z), NOT tanϕ or (R / X)! For pure L or pure C, ϕ = 90° \implies cosϕ = 0, so average power dissipation is strictly zero.</w:t>
             </w:r>
           </w:p>
         </w:tc>
@@ -2062,7 +2062,7 @@
                 <w:color w:val="2D3748"/>
                 <w:sz w:val="19"/>
               </w:rPr>
-              <w:t>A choke coil has high inductance L and very low resistance R, allowing it to reduce AC current with negligible power loss (cos phi approx 0).</w:t>
+              <w:t>Apparent power S = V_(rms)I_(rms) (in VA). True power P = S cosϕ (in W). Reactive power Q = S sinϕ (in VAR).</w:t>
             </w:r>
           </w:p>
         </w:tc>
@@ -2191,7 +2191,7 @@
         <w:rPr>
           <w:sz w:val="20"/>
         </w:rPr>
-        <w:t>Ideal transformer: V_s / V_p = N_s / N_p = I_p / I_s. Efficiency eta = (V_s * I_s) / (V_p * I_p) * 100%. LC oscillation frequency omega = 1 / sqrt(LC) with energy conservation U_total = q^2/(2C) + (1/2)*L*i^2.</w:t>
+        <w:t>Ideal transformer equations: (V_s / V_p) = (N_s / N_p) = (I_p / I_s). Efficiency η = \fracP_(out)P_(in) = (V_s I_s / V_p I_p). LC tank oscillations: charge q(t) = q_0 cos(ω_0 t) with total energy conserved U = (q^2 / 2C) + (1 / 2) L I^2.</w:t>
       </w:r>
     </w:p>
     <w:tbl>
@@ -2229,7 +2229,7 @@
                 <w:color w:val="2D3748"/>
                 <w:sz w:val="19"/>
               </w:rPr>
-              <w:t>Transformers work ONLY with AC, never with steady DC (dPhi/dt = 0 for DC, so secondary voltage is zero).</w:t>
+              <w:t>Transformers operate exclusively on AC; in DC, primary flux is static ((dΦ / dt) = 0), producing zero secondary voltage and potentially burning the primary coil!</w:t>
             </w:r>
           </w:p>
         </w:tc>
@@ -2270,7 +2270,7 @@
                 <w:color w:val="2D3748"/>
                 <w:sz w:val="19"/>
               </w:rPr>
-              <w:t>In step-up transformer (N_s &gt; N_p), voltage increases but current decreases, keeping total power constant.</w:t>
+              <w:t>In step-up transformers (N_s &gt; N_p), voltage increases but current decreases, keeping total power V I conserved under ideal conditions.</w:t>
             </w:r>
           </w:p>
         </w:tc>

</xml_diff>